<commit_message>
did full regression walkthrough
</commit_message>
<xml_diff>
--- a/FounderCheck_Project_Report.docx
+++ b/FounderCheck_Project_Report.docx
@@ -875,6 +875,94 @@
           </w:p>
         </w:tc>
       </w:tr>
+      <w:tr>
+        <w:tblPrEx>
+          <w:tblCellMar>
+            <w:top w:w="0" w:type="dxa"/>
+            <w:bottom w:w="0" w:type="dxa"/>
+          </w:tblCellMar>
+        </w:tblPrEx>
+        <w:tc>
+          <w:tcPr>
+            <w:tcW w:w="4200" w:type="dxa"/>
+            <w:shd w:val="clear" w:color="auto" w:fill="FFFFFF"/>
+          </w:tcPr>
+          <w:p>
+            <w:pPr>
+              <w:jc w:val="center"/>
+            </w:pPr>
+            <w:r>
+              <w:rPr>
+                <w:sz w:val="19"/>
+                <w:szCs w:val="19"/>
+              </w:rPr>
+              <w:t xml:space="preserve">Financial projections engine</w:t>
+            </w:r>
+          </w:p>
+        </w:tc>
+        <w:tc>
+          <w:tcPr>
+            <w:tcW w:w="5160" w:type="dxa"/>
+            <w:shd w:val="clear" w:color="auto" w:fill="FFFFFF"/>
+          </w:tcPr>
+          <w:p>
+            <w:pPr>
+              <w:jc w:val="center"/>
+            </w:pPr>
+            <w:r>
+              <w:rPr>
+                <w:sz w:val="19"/>
+                <w:szCs w:val="19"/>
+              </w:rPr>
+              <w:t xml:space="preserve">Confirmed to produce idea-specific projections that vary by idea, matching each idea to a sector archetype and adjusting it by demand score, market size, and revenue model</w:t>
+            </w:r>
+          </w:p>
+        </w:tc>
+      </w:tr>
+      <w:tr>
+        <w:tblPrEx>
+          <w:tblCellMar>
+            <w:top w:w="0" w:type="dxa"/>
+            <w:bottom w:w="0" w:type="dxa"/>
+          </w:tblCellMar>
+        </w:tblPrEx>
+        <w:tc>
+          <w:tcPr>
+            <w:tcW w:w="4200" w:type="dxa"/>
+            <w:shd w:val="clear" w:color="auto" w:fill="FFFFFF"/>
+          </w:tcPr>
+          <w:p>
+            <w:pPr>
+              <w:jc w:val="center"/>
+            </w:pPr>
+            <w:r>
+              <w:rPr>
+                <w:sz w:val="19"/>
+                <w:szCs w:val="19"/>
+              </w:rPr>
+              <w:t xml:space="preserve">Risk assessment (Risks tab)</w:t>
+            </w:r>
+          </w:p>
+        </w:tc>
+        <w:tc>
+          <w:tcPr>
+            <w:tcW w:w="5160" w:type="dxa"/>
+            <w:shd w:val="clear" w:color="auto" w:fill="FFFFFF"/>
+          </w:tcPr>
+          <w:p>
+            <w:pPr>
+              <w:jc w:val="center"/>
+            </w:pPr>
+            <w:r>
+              <w:rPr>
+                <w:sz w:val="19"/>
+                <w:szCs w:val="19"/>
+              </w:rPr>
+              <w:t xml:space="preserve">Confirmed to generate real high and medium priority risks with likelihood, impact, and mitigation, placed correctly on a likelihood-impact heat map</w:t>
+            </w:r>
+          </w:p>
+        </w:tc>
+      </w:tr>
     </w:tbl>
     <w:p>
       <w:pPr>
@@ -1153,21 +1241,7 @@
           <w:sz w:val="21"/>
           <w:szCs w:val="21"/>
         </w:rPr>
-        <w:t>Two limitations are disclo</w:t>
-      </w:r>
-      <w:r>
-        <w:rPr>
-          <w:sz w:val="21"/>
-          <w:szCs w:val="21"/>
-        </w:rPr>
-        <w:t>sed here directly rather than left for a reviewer to discover. First, the financial projection engine currently uses generic assumptions rather than assumptions specific to each idea, so projected figures can look similar across different ideas. Second, th</w:t>
-      </w:r>
-      <w:r>
-        <w:rPr>
-          <w:sz w:val="21"/>
-          <w:szCs w:val="21"/>
-        </w:rPr>
-        <w:t>e risk assessment module is not yet wired into the analysis pipeline. The underlying function exists, but nothing currently calls it, so this section honestly reports that it is not available yet rather than showing placeholder content as if it were real.</w:t>
+        <w:t xml:space="preserve">Two limitations previously disclosed here have since been resolved. The financial projection engine, which once used generic assumptions, now produces idea-specific projections by matching each idea to a sector archetype and adjusting it by demand score, market size, and revenue model. The risk assessment module, whose function existed but was not called, is now wired into the extended analysis pipeline and rendered in the Risks tab as high and medium priority risks with likelihood, impact, and mitigation.</w:t>
       </w:r>
     </w:p>
     <w:p>
@@ -1179,7 +1253,7 @@
           <w:sz w:val="21"/>
           <w:szCs w:val="21"/>
         </w:rPr>
-        <w:t>A further, more structural limitation is that analysis is currently generated from a language model's internal knowledge rather than pulled from live, citable sources, so competitor names and market figures shown to a user are plausible estimates, not veri</w:t>
+        <w:t>A remaining, more structural limitation is that analysis is currently generated from a language model's internal knowledge rather than pulled from live, citable sources, so competitor names and market figures shown to a user are plausible estimates, not veri</w:t>
       </w:r>
       <w:r>
         <w:rPr>
@@ -1240,61 +1314,6 @@
           <w:szCs w:val="21"/>
         </w:rPr>
         <w:t>Add a Bangla language mode for the analysis output</w:t>
-      </w:r>
-    </w:p>
-    <w:p>
-      <w:pPr>
-        <w:pStyle w:val="ListParagraph"/>
-        <w:numPr>
-          <w:ilvl w:val="0"/>
-          <w:numId w:val="3"/>
-        </w:numPr>
-        <w:spacing w:after="60"/>
-      </w:pPr>
-      <w:r>
-        <w:rPr>
-          <w:sz w:val="21"/>
-          <w:szCs w:val="21"/>
-        </w:rPr>
-        <w:t xml:space="preserve">Move the financial engine to </w:t>
-      </w:r>
-      <w:r>
-        <w:rPr>
-          <w:sz w:val="21"/>
-          <w:szCs w:val="21"/>
-        </w:rPr>
-        <w:t>idea-specific</w:t>
-      </w:r>
-      <w:r>
-        <w:rPr>
-          <w:sz w:val="21"/>
-          <w:szCs w:val="21"/>
-        </w:rPr>
-        <w:t xml:space="preserve"> assumptions</w:t>
-      </w:r>
-    </w:p>
-    <w:p>
-      <w:pPr>
-        <w:pStyle w:val="ListParagraph"/>
-        <w:numPr>
-          <w:ilvl w:val="0"/>
-          <w:numId w:val="3"/>
-        </w:numPr>
-        <w:spacing w:after="60"/>
-      </w:pPr>
-      <w:r>
-        <w:rPr>
-          <w:sz w:val="21"/>
-          <w:szCs w:val="21"/>
-        </w:rPr>
-        <w:t>Wire the existing risk assessment function into the c</w:t>
-      </w:r>
-      <w:r>
-        <w:rPr>
-          <w:sz w:val="21"/>
-          <w:szCs w:val="21"/>
-        </w:rPr>
-        <w:t>ore pipeline</w:t>
       </w:r>
     </w:p>
     <w:p>

</xml_diff>